<commit_message>
CV and On a Mission updated
CV and On a Mission updated dd. 24/02
</commit_message>
<xml_diff>
--- a/assets/doc/abresume_func.docx
+++ b/assets/doc/abresume_func.docx
@@ -281,21 +281,21 @@
           <w:rFonts w:ascii="Arial" w:hAnsi="Arial" w:cs="Arial"/>
           <w:sz w:val="20"/>
         </w:rPr>
-        <w:t xml:space="preserve">with more than </w:t>
-      </w:r>
-      <w:r>
-        <w:rPr>
-          <w:rFonts w:ascii="Arial" w:hAnsi="Arial" w:cs="Arial"/>
-          <w:sz w:val="20"/>
-        </w:rPr>
-        <w:t>2</w:t>
-      </w:r>
-      <w:r>
-        <w:rPr>
-          <w:rFonts w:ascii="Arial" w:hAnsi="Arial" w:cs="Arial"/>
-          <w:sz w:val="20"/>
-        </w:rPr>
-        <w:t>5</w:t>
+        <w:t xml:space="preserve">with </w:t>
+      </w:r>
+      <w:r>
+        <w:rPr>
+          <w:rFonts w:ascii="Arial" w:hAnsi="Arial" w:cs="Arial"/>
+          <w:sz w:val="20"/>
+        </w:rPr>
+        <w:t>30</w:t>
+      </w:r>
+      <w:r>
+        <w:rPr>
+          <w:rFonts w:ascii="Arial" w:hAnsi="Arial" w:cs="Arial"/>
+          <w:sz w:val="20"/>
+        </w:rPr>
+        <w:t>+</w:t>
       </w:r>
       <w:r>
         <w:rPr>
@@ -2884,7 +2884,14 @@
           <w:rFonts w:ascii="Arial" w:hAnsi="Arial" w:cs="Arial"/>
           <w:sz w:val="20"/>
         </w:rPr>
-        <w:t xml:space="preserve">Projects managed include: </w:t>
+        <w:t>Projects managed</w:t>
+      </w:r>
+      <w:r>
+        <w:rPr>
+          <w:rFonts w:ascii="Arial" w:hAnsi="Arial" w:cs="Arial"/>
+          <w:sz w:val="20"/>
+        </w:rPr>
+        <w:t xml:space="preserve"> include: </w:t>
       </w:r>
     </w:p>
     <w:p>
@@ -2907,112 +2914,49 @@
           <w:rFonts w:ascii="Arial" w:hAnsi="Arial" w:cs="Arial"/>
           <w:sz w:val="20"/>
         </w:rPr>
-        <w:t xml:space="preserve">Nexus transition programme – replace incumbent partners </w:t>
-      </w:r>
-      <w:r>
-        <w:rPr>
-          <w:rFonts w:ascii="Arial" w:hAnsi="Arial" w:cs="Arial"/>
-          <w:sz w:val="20"/>
-        </w:rPr>
-        <w:t>Cognizant and Hays companies</w:t>
-      </w:r>
-      <w:r>
-        <w:rPr>
-          <w:rFonts w:ascii="Arial" w:hAnsi="Arial" w:cs="Arial"/>
-          <w:sz w:val="20"/>
-        </w:rPr>
-        <w:t xml:space="preserve"> </w:t>
-      </w:r>
-      <w:r>
-        <w:rPr>
-          <w:rFonts w:ascii="Arial" w:hAnsi="Arial" w:cs="Arial"/>
-          <w:sz w:val="20"/>
-        </w:rPr>
-        <w:t>by Info</w:t>
-      </w:r>
-      <w:r>
-        <w:rPr>
-          <w:rFonts w:ascii="Arial" w:hAnsi="Arial" w:cs="Arial"/>
-          <w:sz w:val="20"/>
-        </w:rPr>
-        <w:t>s</w:t>
-      </w:r>
-      <w:r>
-        <w:rPr>
-          <w:rFonts w:ascii="Arial" w:hAnsi="Arial" w:cs="Arial"/>
-          <w:sz w:val="20"/>
-        </w:rPr>
-        <w:t xml:space="preserve">ys for Build </w:t>
-      </w:r>
-      <w:r>
-        <w:rPr>
-          <w:rFonts w:ascii="Arial" w:hAnsi="Arial" w:cs="Arial"/>
-          <w:sz w:val="20"/>
-        </w:rPr>
-        <w:t xml:space="preserve">and </w:t>
-      </w:r>
-      <w:r>
-        <w:rPr>
-          <w:rFonts w:ascii="Arial" w:hAnsi="Arial" w:cs="Arial"/>
-          <w:sz w:val="20"/>
-        </w:rPr>
-        <w:t>Ins</w:t>
-      </w:r>
-      <w:r>
-        <w:rPr>
-          <w:rFonts w:ascii="Arial" w:hAnsi="Arial" w:cs="Arial"/>
-          <w:sz w:val="20"/>
-        </w:rPr>
-        <w:t>p</w:t>
-      </w:r>
-      <w:r>
-        <w:rPr>
-          <w:rFonts w:ascii="Arial" w:hAnsi="Arial" w:cs="Arial"/>
-          <w:sz w:val="20"/>
-        </w:rPr>
-        <w:t xml:space="preserve">rint </w:t>
-      </w:r>
-      <w:r>
-        <w:rPr>
-          <w:rFonts w:ascii="Arial" w:hAnsi="Arial" w:cs="Arial"/>
-          <w:sz w:val="20"/>
-        </w:rPr>
-        <w:t>t</w:t>
-      </w:r>
-      <w:r>
-        <w:rPr>
-          <w:rFonts w:ascii="Arial" w:hAnsi="Arial" w:cs="Arial"/>
-          <w:sz w:val="20"/>
-        </w:rPr>
-        <w:t xml:space="preserve">esting, E2E testing, Software factory and </w:t>
-      </w:r>
-      <w:r>
-        <w:rPr>
-          <w:rFonts w:ascii="Arial" w:hAnsi="Arial" w:cs="Arial"/>
-          <w:sz w:val="20"/>
-        </w:rPr>
-        <w:t>Release Management</w:t>
-      </w:r>
-      <w:r>
-        <w:rPr>
-          <w:rFonts w:ascii="Arial" w:hAnsi="Arial" w:cs="Arial"/>
-          <w:sz w:val="20"/>
-        </w:rPr>
-        <w:t xml:space="preserve"> </w:t>
-      </w:r>
-      <w:r>
-        <w:rPr>
-          <w:rFonts w:ascii="Arial" w:hAnsi="Arial" w:cs="Arial"/>
-          <w:sz w:val="20"/>
-        </w:rPr>
-        <w:t>and NetCracker for Insprint testing</w:t>
-      </w:r>
-      <w:r>
-        <w:rPr>
-          <w:rFonts w:ascii="Arial" w:hAnsi="Arial" w:cs="Arial"/>
-          <w:sz w:val="20"/>
-        </w:rPr>
-        <w:t>.</w:t>
+        <w:t xml:space="preserve">Manage the Change Capability Cockpit </w:t>
+      </w:r>
+      <w:r>
+        <w:rPr>
+          <w:rFonts w:ascii="Arial" w:hAnsi="Arial" w:cs="Arial"/>
+          <w:sz w:val="20"/>
+        </w:rPr>
+        <w:t xml:space="preserve">- </w:t>
+      </w:r>
+      <w:r>
+        <w:rPr>
+          <w:rFonts w:ascii="Arial" w:hAnsi="Arial" w:cs="Arial"/>
+          <w:sz w:val="20"/>
+        </w:rPr>
+        <w:t>ADKAR methodology</w:t>
+      </w:r>
+      <w:r>
+        <w:rPr>
+          <w:rFonts w:ascii="Arial" w:hAnsi="Arial" w:cs="Arial"/>
+          <w:sz w:val="20"/>
+        </w:rPr>
+        <w:t xml:space="preserve">, </w:t>
+      </w:r>
+      <w:r>
+        <w:rPr>
+          <w:rFonts w:ascii="Arial" w:hAnsi="Arial" w:cs="Arial"/>
+          <w:sz w:val="20"/>
+        </w:rPr>
+        <w:t xml:space="preserve">synchronize activities of Capability </w:t>
+      </w:r>
+      <w:r>
+        <w:rPr>
+          <w:rFonts w:ascii="Arial" w:hAnsi="Arial" w:cs="Arial"/>
+          <w:sz w:val="20"/>
+        </w:rPr>
+        <w:t>O</w:t>
+      </w:r>
+      <w:r>
+        <w:rPr>
+          <w:rFonts w:ascii="Arial" w:hAnsi="Arial" w:cs="Arial"/>
+          <w:sz w:val="20"/>
+        </w:rPr>
+        <w:t>wners and Change Agents</w:t>
       </w:r>
     </w:p>
     <w:p>
@@ -3035,21 +2979,14 @@
           <w:rFonts w:ascii="Arial" w:hAnsi="Arial" w:cs="Arial"/>
           <w:sz w:val="20"/>
         </w:rPr>
-        <w:t xml:space="preserve">Network Service Assurance initiative – </w:t>
-      </w:r>
-      <w:r>
-        <w:rPr>
-          <w:rFonts w:ascii="Arial" w:hAnsi="Arial" w:cs="Arial"/>
-          <w:sz w:val="20"/>
-        </w:rPr>
-        <w:t>Improve the customer experience and financials</w:t>
-      </w:r>
-      <w:r>
-        <w:rPr>
-          <w:rFonts w:ascii="Arial" w:hAnsi="Arial" w:cs="Arial"/>
-          <w:sz w:val="20"/>
-        </w:rPr>
-        <w:t xml:space="preserve"> of the maintenance</w:t>
+        <w:t xml:space="preserve">Nexus transition programme – replace incumbent partners </w:t>
+      </w:r>
+      <w:r>
+        <w:rPr>
+          <w:rFonts w:ascii="Arial" w:hAnsi="Arial" w:cs="Arial"/>
+          <w:sz w:val="20"/>
+        </w:rPr>
+        <w:t>Cognizant and Hays companies</w:t>
       </w:r>
       <w:r>
         <w:rPr>
@@ -3063,42 +3000,119 @@
           <w:rFonts w:ascii="Arial" w:hAnsi="Arial" w:cs="Arial"/>
           <w:sz w:val="20"/>
         </w:rPr>
-        <w:t xml:space="preserve">of </w:t>
-      </w:r>
-      <w:r>
-        <w:rPr>
-          <w:rFonts w:ascii="Arial" w:hAnsi="Arial" w:cs="Arial"/>
-          <w:sz w:val="20"/>
-        </w:rPr>
-        <w:t xml:space="preserve">Telenet’s Hybrid Fibre Coax </w:t>
-      </w:r>
-      <w:r>
-        <w:rPr>
-          <w:rFonts w:ascii="Arial" w:hAnsi="Arial" w:cs="Arial"/>
-          <w:sz w:val="20"/>
-        </w:rPr>
-        <w:t xml:space="preserve">and Fibre network </w:t>
-      </w:r>
-      <w:r>
-        <w:rPr>
-          <w:rFonts w:ascii="Arial" w:hAnsi="Arial" w:cs="Arial"/>
-          <w:sz w:val="20"/>
-        </w:rPr>
-        <w:t xml:space="preserve">by introducing new </w:t>
-      </w:r>
-      <w:r>
-        <w:rPr>
-          <w:rFonts w:ascii="Arial" w:hAnsi="Arial" w:cs="Arial"/>
-          <w:sz w:val="20"/>
-        </w:rPr>
-        <w:t>tools based on available operational data</w:t>
-      </w:r>
-      <w:r>
-        <w:rPr>
-          <w:rFonts w:ascii="Arial" w:hAnsi="Arial" w:cs="Arial"/>
-          <w:sz w:val="20"/>
-        </w:rPr>
-        <w:t xml:space="preserve"> (predictive maintenance)</w:t>
+        <w:t>by Info</w:t>
+      </w:r>
+      <w:r>
+        <w:rPr>
+          <w:rFonts w:ascii="Arial" w:hAnsi="Arial" w:cs="Arial"/>
+          <w:sz w:val="20"/>
+        </w:rPr>
+        <w:t>s</w:t>
+      </w:r>
+      <w:r>
+        <w:rPr>
+          <w:rFonts w:ascii="Arial" w:hAnsi="Arial" w:cs="Arial"/>
+          <w:sz w:val="20"/>
+        </w:rPr>
+        <w:t xml:space="preserve">ys for Build </w:t>
+      </w:r>
+      <w:r>
+        <w:rPr>
+          <w:rFonts w:ascii="Arial" w:hAnsi="Arial" w:cs="Arial"/>
+          <w:sz w:val="20"/>
+        </w:rPr>
+        <w:t xml:space="preserve">and </w:t>
+      </w:r>
+      <w:r>
+        <w:rPr>
+          <w:rFonts w:ascii="Arial" w:hAnsi="Arial" w:cs="Arial"/>
+          <w:sz w:val="20"/>
+        </w:rPr>
+        <w:t>Ins</w:t>
+      </w:r>
+      <w:r>
+        <w:rPr>
+          <w:rFonts w:ascii="Arial" w:hAnsi="Arial" w:cs="Arial"/>
+          <w:sz w:val="20"/>
+        </w:rPr>
+        <w:t>p</w:t>
+      </w:r>
+      <w:r>
+        <w:rPr>
+          <w:rFonts w:ascii="Arial" w:hAnsi="Arial" w:cs="Arial"/>
+          <w:sz w:val="20"/>
+        </w:rPr>
+        <w:t xml:space="preserve">rint </w:t>
+      </w:r>
+      <w:r>
+        <w:rPr>
+          <w:rFonts w:ascii="Arial" w:hAnsi="Arial" w:cs="Arial"/>
+          <w:sz w:val="20"/>
+        </w:rPr>
+        <w:t>t</w:t>
+      </w:r>
+      <w:r>
+        <w:rPr>
+          <w:rFonts w:ascii="Arial" w:hAnsi="Arial" w:cs="Arial"/>
+          <w:sz w:val="20"/>
+        </w:rPr>
+        <w:t xml:space="preserve">esting, E2E testing, Software factory and </w:t>
+      </w:r>
+      <w:r>
+        <w:rPr>
+          <w:rFonts w:ascii="Arial" w:hAnsi="Arial" w:cs="Arial"/>
+          <w:sz w:val="20"/>
+        </w:rPr>
+        <w:t>Release Management</w:t>
+      </w:r>
+      <w:r>
+        <w:rPr>
+          <w:rFonts w:ascii="Arial" w:hAnsi="Arial" w:cs="Arial"/>
+          <w:sz w:val="20"/>
+        </w:rPr>
+        <w:t xml:space="preserve"> </w:t>
+      </w:r>
+      <w:r>
+        <w:rPr>
+          <w:rFonts w:ascii="Arial" w:hAnsi="Arial" w:cs="Arial"/>
+          <w:sz w:val="20"/>
+        </w:rPr>
+        <w:t xml:space="preserve">and </w:t>
+      </w:r>
+      <w:r>
+        <w:rPr>
+          <w:rFonts w:ascii="Arial" w:hAnsi="Arial" w:cs="Arial"/>
+          <w:sz w:val="20"/>
+        </w:rPr>
+        <w:t>Netcracker</w:t>
+      </w:r>
+      <w:r>
+        <w:rPr>
+          <w:rFonts w:ascii="Arial" w:hAnsi="Arial" w:cs="Arial"/>
+          <w:sz w:val="20"/>
+        </w:rPr>
+        <w:t xml:space="preserve"> for Insprint testing</w:t>
+      </w:r>
+      <w:r>
+        <w:rPr>
+          <w:rFonts w:ascii="Arial" w:hAnsi="Arial" w:cs="Arial"/>
+          <w:sz w:val="20"/>
+        </w:rPr>
+        <w:t xml:space="preserve"> (KT, reverse KT, </w:t>
+      </w:r>
+      <w:r>
+        <w:rPr>
+          <w:rFonts w:ascii="Arial" w:hAnsi="Arial" w:cs="Arial"/>
+          <w:sz w:val="20"/>
+        </w:rPr>
+        <w:t>s</w:t>
+      </w:r>
+      <w:r>
+        <w:rPr>
+          <w:rFonts w:ascii="Arial" w:hAnsi="Arial" w:cs="Arial"/>
+          <w:sz w:val="20"/>
+        </w:rPr>
+        <w:t>hadowing, reverse shadowing)</w:t>
       </w:r>
       <w:r>
         <w:rPr>
@@ -3128,14 +3142,21 @@
           <w:rFonts w:ascii="Arial" w:hAnsi="Arial" w:cs="Arial"/>
           <w:sz w:val="20"/>
         </w:rPr>
-        <w:t xml:space="preserve">Appointment Orchestration – Initiative to streamline </w:t>
-      </w:r>
-      <w:r>
-        <w:rPr>
-          <w:rFonts w:ascii="Arial" w:hAnsi="Arial" w:cs="Arial"/>
-          <w:sz w:val="20"/>
-        </w:rPr>
-        <w:t>all</w:t>
+        <w:t xml:space="preserve">Network Service Assurance initiative – </w:t>
+      </w:r>
+      <w:r>
+        <w:rPr>
+          <w:rFonts w:ascii="Arial" w:hAnsi="Arial" w:cs="Arial"/>
+          <w:sz w:val="20"/>
+        </w:rPr>
+        <w:t>Improve the customer experience and financials</w:t>
+      </w:r>
+      <w:r>
+        <w:rPr>
+          <w:rFonts w:ascii="Arial" w:hAnsi="Arial" w:cs="Arial"/>
+          <w:sz w:val="20"/>
+        </w:rPr>
+        <w:t xml:space="preserve"> of the maintenance</w:t>
       </w:r>
       <w:r>
         <w:rPr>
@@ -3149,49 +3170,49 @@
           <w:rFonts w:ascii="Arial" w:hAnsi="Arial" w:cs="Arial"/>
           <w:sz w:val="20"/>
         </w:rPr>
-        <w:t>appointments for onsite interventions of several external partners (Unit-T, Wyre</w:t>
-      </w:r>
-      <w:r>
-        <w:rPr>
-          <w:rFonts w:ascii="Arial" w:hAnsi="Arial" w:cs="Arial"/>
-          <w:sz w:val="20"/>
-        </w:rPr>
-        <w:t>…</w:t>
-      </w:r>
-      <w:r>
-        <w:rPr>
-          <w:rFonts w:ascii="Arial" w:hAnsi="Arial" w:cs="Arial"/>
-          <w:sz w:val="20"/>
-        </w:rPr>
-        <w:t>)</w:t>
-      </w:r>
-      <w:r>
-        <w:rPr>
-          <w:rFonts w:ascii="Arial" w:hAnsi="Arial" w:cs="Arial"/>
-          <w:sz w:val="20"/>
-        </w:rPr>
-        <w:t xml:space="preserve">, Telenet and the </w:t>
-      </w:r>
-      <w:r>
-        <w:rPr>
-          <w:rFonts w:ascii="Arial" w:hAnsi="Arial" w:cs="Arial"/>
-          <w:sz w:val="20"/>
-        </w:rPr>
-        <w:t>C</w:t>
-      </w:r>
-      <w:r>
-        <w:rPr>
-          <w:rFonts w:ascii="Arial" w:hAnsi="Arial" w:cs="Arial"/>
-          <w:sz w:val="20"/>
-        </w:rPr>
-        <w:t>ustomer.</w:t>
-      </w:r>
-      <w:r>
-        <w:rPr>
-          <w:rFonts w:ascii="Arial" w:hAnsi="Arial" w:cs="Arial"/>
-          <w:sz w:val="20"/>
-        </w:rPr>
-        <w:t xml:space="preserve"> </w:t>
+        <w:t xml:space="preserve">of </w:t>
+      </w:r>
+      <w:r>
+        <w:rPr>
+          <w:rFonts w:ascii="Arial" w:hAnsi="Arial" w:cs="Arial"/>
+          <w:sz w:val="20"/>
+        </w:rPr>
+        <w:t xml:space="preserve">Telenet’s Hybrid Fibre Coax </w:t>
+      </w:r>
+      <w:r>
+        <w:rPr>
+          <w:rFonts w:ascii="Arial" w:hAnsi="Arial" w:cs="Arial"/>
+          <w:sz w:val="20"/>
+        </w:rPr>
+        <w:t xml:space="preserve">and Fibre network </w:t>
+      </w:r>
+      <w:r>
+        <w:rPr>
+          <w:rFonts w:ascii="Arial" w:hAnsi="Arial" w:cs="Arial"/>
+          <w:sz w:val="20"/>
+        </w:rPr>
+        <w:t xml:space="preserve">by introducing new </w:t>
+      </w:r>
+      <w:r>
+        <w:rPr>
+          <w:rFonts w:ascii="Arial" w:hAnsi="Arial" w:cs="Arial"/>
+          <w:sz w:val="20"/>
+        </w:rPr>
+        <w:t>tools based on available operational data</w:t>
+      </w:r>
+      <w:r>
+        <w:rPr>
+          <w:rFonts w:ascii="Arial" w:hAnsi="Arial" w:cs="Arial"/>
+          <w:sz w:val="20"/>
+        </w:rPr>
+        <w:t xml:space="preserve"> (predictive maintenance)</w:t>
+      </w:r>
+      <w:r>
+        <w:rPr>
+          <w:rFonts w:ascii="Arial" w:hAnsi="Arial" w:cs="Arial"/>
+          <w:sz w:val="20"/>
+        </w:rPr>
+        <w:t>.</w:t>
       </w:r>
     </w:p>
     <w:p>
@@ -3214,7 +3235,100 @@
           <w:rFonts w:ascii="Arial" w:hAnsi="Arial" w:cs="Arial"/>
           <w:sz w:val="20"/>
         </w:rPr>
-        <w:t>Introduction of new Telenet product</w:t>
+        <w:t xml:space="preserve">Appointment Orchestration – Initiative to streamline </w:t>
+      </w:r>
+      <w:r>
+        <w:rPr>
+          <w:rFonts w:ascii="Arial" w:hAnsi="Arial" w:cs="Arial"/>
+          <w:sz w:val="20"/>
+        </w:rPr>
+        <w:t>all</w:t>
+      </w:r>
+      <w:r>
+        <w:rPr>
+          <w:rFonts w:ascii="Arial" w:hAnsi="Arial" w:cs="Arial"/>
+          <w:sz w:val="20"/>
+        </w:rPr>
+        <w:t xml:space="preserve"> </w:t>
+      </w:r>
+      <w:r>
+        <w:rPr>
+          <w:rFonts w:ascii="Arial" w:hAnsi="Arial" w:cs="Arial"/>
+          <w:sz w:val="20"/>
+        </w:rPr>
+        <w:t>appointments for onsite interventions of several external partners (Unit-T, Wyre</w:t>
+      </w:r>
+      <w:r>
+        <w:rPr>
+          <w:rFonts w:ascii="Arial" w:hAnsi="Arial" w:cs="Arial"/>
+          <w:sz w:val="20"/>
+        </w:rPr>
+        <w:t>…</w:t>
+      </w:r>
+      <w:r>
+        <w:rPr>
+          <w:rFonts w:ascii="Arial" w:hAnsi="Arial" w:cs="Arial"/>
+          <w:sz w:val="20"/>
+        </w:rPr>
+        <w:t>)</w:t>
+      </w:r>
+      <w:r>
+        <w:rPr>
+          <w:rFonts w:ascii="Arial" w:hAnsi="Arial" w:cs="Arial"/>
+          <w:sz w:val="20"/>
+        </w:rPr>
+        <w:t xml:space="preserve">, Telenet and the </w:t>
+      </w:r>
+      <w:r>
+        <w:rPr>
+          <w:rFonts w:ascii="Arial" w:hAnsi="Arial" w:cs="Arial"/>
+          <w:sz w:val="20"/>
+        </w:rPr>
+        <w:t>C</w:t>
+      </w:r>
+      <w:r>
+        <w:rPr>
+          <w:rFonts w:ascii="Arial" w:hAnsi="Arial" w:cs="Arial"/>
+          <w:sz w:val="20"/>
+        </w:rPr>
+        <w:t>ustomer.</w:t>
+      </w:r>
+      <w:r>
+        <w:rPr>
+          <w:rFonts w:ascii="Arial" w:hAnsi="Arial" w:cs="Arial"/>
+          <w:sz w:val="20"/>
+        </w:rPr>
+        <w:t xml:space="preserve"> </w:t>
+      </w:r>
+    </w:p>
+    <w:p>
+      <w:pPr>
+        <w:pStyle w:val="ListParagraph"/>
+        <w:numPr>
+          <w:ilvl w:val="1"/>
+          <w:numId w:val="5"/>
+        </w:numPr>
+        <w:spacing w:after="60" w:line="312" w:lineRule="auto"/>
+        <w:contextualSpacing w:val="0"/>
+        <w:jc w:val="both"/>
+        <w:rPr>
+          <w:rFonts w:ascii="Arial" w:hAnsi="Arial" w:cs="Arial"/>
+          <w:sz w:val="20"/>
+        </w:rPr>
+      </w:pPr>
+      <w:r>
+        <w:rPr>
+          <w:rFonts w:ascii="Arial" w:hAnsi="Arial" w:cs="Arial"/>
+          <w:sz w:val="20"/>
+        </w:rPr>
+        <w:t xml:space="preserve">Introduction </w:t>
+      </w:r>
+      <w:r>
+        <w:rPr>
+          <w:rFonts w:ascii="Arial" w:hAnsi="Arial" w:cs="Arial"/>
+          <w:sz w:val="20"/>
+        </w:rPr>
+        <w:t>of new Telenet product</w:t>
       </w:r>
       <w:r>
         <w:rPr>
@@ -3251,28 +3365,14 @@
           <w:rFonts w:ascii="Arial" w:hAnsi="Arial" w:cs="Arial"/>
           <w:sz w:val="20"/>
         </w:rPr>
-        <w:t>In Home Connectivity 2.0</w:t>
-      </w:r>
-      <w:r>
-        <w:rPr>
-          <w:rFonts w:ascii="Arial" w:hAnsi="Arial" w:cs="Arial"/>
-          <w:sz w:val="20"/>
-        </w:rPr>
-        <w:t xml:space="preserve"> </w:t>
-      </w:r>
-      <w:r>
-        <w:rPr>
-          <w:rFonts w:ascii="Arial" w:hAnsi="Arial" w:cs="Arial"/>
-          <w:sz w:val="20"/>
-        </w:rPr>
-        <w:t xml:space="preserve">- </w:t>
-      </w:r>
-      <w:r>
-        <w:rPr>
-          <w:rFonts w:ascii="Arial" w:hAnsi="Arial" w:cs="Arial"/>
-          <w:sz w:val="20"/>
-        </w:rPr>
-        <w:t>use of Plume pods iso Power Boosters</w:t>
+        <w:t xml:space="preserve">Voice Pro </w:t>
+      </w:r>
+      <w:r>
+        <w:rPr>
+          <w:rFonts w:ascii="Arial" w:hAnsi="Arial" w:cs="Arial"/>
+          <w:sz w:val="20"/>
+        </w:rPr>
+        <w:t>– PABX functionality in the cloud for SOHO customers</w:t>
       </w:r>
     </w:p>
     <w:p>
@@ -3295,49 +3395,28 @@
           <w:rFonts w:ascii="Arial" w:hAnsi="Arial" w:cs="Arial"/>
           <w:sz w:val="20"/>
         </w:rPr>
-        <w:t>I</w:t>
-      </w:r>
-      <w:r>
-        <w:rPr>
-          <w:rFonts w:ascii="Arial" w:hAnsi="Arial" w:cs="Arial"/>
-          <w:sz w:val="20"/>
-        </w:rPr>
-        <w:t xml:space="preserve">ntroduction of </w:t>
-      </w:r>
-      <w:r>
-        <w:rPr>
-          <w:rFonts w:ascii="Arial" w:hAnsi="Arial" w:cs="Arial"/>
-          <w:sz w:val="20"/>
-        </w:rPr>
-        <w:t xml:space="preserve">a </w:t>
-      </w:r>
-      <w:r>
-        <w:rPr>
-          <w:rFonts w:ascii="Arial" w:hAnsi="Arial" w:cs="Arial"/>
-          <w:sz w:val="20"/>
-        </w:rPr>
-        <w:t xml:space="preserve">new All Internet + DTV </w:t>
-      </w:r>
-      <w:r>
-        <w:rPr>
-          <w:rFonts w:ascii="Arial" w:hAnsi="Arial" w:cs="Arial"/>
-          <w:sz w:val="20"/>
-        </w:rPr>
-        <w:t xml:space="preserve">(“2P”) </w:t>
-      </w:r>
-      <w:r>
-        <w:rPr>
-          <w:rFonts w:ascii="Arial" w:hAnsi="Arial" w:cs="Arial"/>
-          <w:sz w:val="20"/>
-        </w:rPr>
-        <w:t>prod</w:t>
-      </w:r>
-      <w:r>
-        <w:rPr>
-          <w:rFonts w:ascii="Arial" w:hAnsi="Arial" w:cs="Arial"/>
-          <w:sz w:val="20"/>
-        </w:rPr>
-        <w:t>uct</w:t>
+        <w:t>In Home Connectivity 2.0</w:t>
+      </w:r>
+      <w:r>
+        <w:rPr>
+          <w:rFonts w:ascii="Arial" w:hAnsi="Arial" w:cs="Arial"/>
+          <w:sz w:val="20"/>
+        </w:rPr>
+        <w:t xml:space="preserve"> </w:t>
+      </w:r>
+      <w:r>
+        <w:rPr>
+          <w:rFonts w:ascii="Arial" w:hAnsi="Arial" w:cs="Arial"/>
+          <w:sz w:val="20"/>
+        </w:rPr>
+        <w:t xml:space="preserve">- </w:t>
+      </w:r>
+      <w:r>
+        <w:rPr>
+          <w:rFonts w:ascii="Arial" w:hAnsi="Arial" w:cs="Arial"/>
+          <w:sz w:val="20"/>
+        </w:rPr>
+        <w:t>use of Plume pods iso Power Boosters</w:t>
       </w:r>
     </w:p>
     <w:p>
@@ -3360,6 +3439,71 @@
           <w:rFonts w:ascii="Arial" w:hAnsi="Arial" w:cs="Arial"/>
           <w:sz w:val="20"/>
         </w:rPr>
+        <w:t>I</w:t>
+      </w:r>
+      <w:r>
+        <w:rPr>
+          <w:rFonts w:ascii="Arial" w:hAnsi="Arial" w:cs="Arial"/>
+          <w:sz w:val="20"/>
+        </w:rPr>
+        <w:t xml:space="preserve">ntroduction of </w:t>
+      </w:r>
+      <w:r>
+        <w:rPr>
+          <w:rFonts w:ascii="Arial" w:hAnsi="Arial" w:cs="Arial"/>
+          <w:sz w:val="20"/>
+        </w:rPr>
+        <w:t xml:space="preserve">a </w:t>
+      </w:r>
+      <w:r>
+        <w:rPr>
+          <w:rFonts w:ascii="Arial" w:hAnsi="Arial" w:cs="Arial"/>
+          <w:sz w:val="20"/>
+        </w:rPr>
+        <w:t xml:space="preserve">new All Internet + DTV </w:t>
+      </w:r>
+      <w:r>
+        <w:rPr>
+          <w:rFonts w:ascii="Arial" w:hAnsi="Arial" w:cs="Arial"/>
+          <w:sz w:val="20"/>
+        </w:rPr>
+        <w:t xml:space="preserve">(“2P”) </w:t>
+      </w:r>
+      <w:r>
+        <w:rPr>
+          <w:rFonts w:ascii="Arial" w:hAnsi="Arial" w:cs="Arial"/>
+          <w:sz w:val="20"/>
+        </w:rPr>
+        <w:t>prod</w:t>
+      </w:r>
+      <w:r>
+        <w:rPr>
+          <w:rFonts w:ascii="Arial" w:hAnsi="Arial" w:cs="Arial"/>
+          <w:sz w:val="20"/>
+        </w:rPr>
+        <w:t>uct</w:t>
+      </w:r>
+    </w:p>
+    <w:p>
+      <w:pPr>
+        <w:pStyle w:val="ListParagraph"/>
+        <w:numPr>
+          <w:ilvl w:val="2"/>
+          <w:numId w:val="5"/>
+        </w:numPr>
+        <w:spacing w:after="60" w:line="312" w:lineRule="auto"/>
+        <w:contextualSpacing w:val="0"/>
+        <w:jc w:val="both"/>
+        <w:rPr>
+          <w:rFonts w:ascii="Arial" w:hAnsi="Arial" w:cs="Arial"/>
+          <w:sz w:val="20"/>
+        </w:rPr>
+      </w:pPr>
+      <w:r>
+        <w:rPr>
+          <w:rFonts w:ascii="Arial" w:hAnsi="Arial" w:cs="Arial"/>
+          <w:sz w:val="20"/>
+        </w:rPr>
         <w:t>Fibre-to-the-Home programme (“FTTH”)</w:t>
       </w:r>
     </w:p>
@@ -3383,6 +3527,36 @@
           <w:rFonts w:ascii="Arial" w:hAnsi="Arial" w:cs="Arial"/>
           <w:sz w:val="20"/>
         </w:rPr>
+        <w:t>Regulatory relat</w:t>
+      </w:r>
+      <w:r>
+        <w:rPr>
+          <w:rFonts w:ascii="Arial" w:hAnsi="Arial" w:cs="Arial"/>
+          <w:sz w:val="20"/>
+        </w:rPr>
+        <w:t>ed projects</w:t>
+      </w:r>
+    </w:p>
+    <w:p>
+      <w:pPr>
+        <w:pStyle w:val="ListParagraph"/>
+        <w:numPr>
+          <w:ilvl w:val="2"/>
+          <w:numId w:val="5"/>
+        </w:numPr>
+        <w:spacing w:after="60" w:line="312" w:lineRule="auto"/>
+        <w:contextualSpacing w:val="0"/>
+        <w:jc w:val="both"/>
+        <w:rPr>
+          <w:rFonts w:ascii="Arial" w:hAnsi="Arial" w:cs="Arial"/>
+          <w:sz w:val="20"/>
+        </w:rPr>
+      </w:pPr>
+      <w:r>
+        <w:rPr>
+          <w:rFonts w:ascii="Arial" w:hAnsi="Arial" w:cs="Arial"/>
+          <w:sz w:val="20"/>
+        </w:rPr>
         <w:t xml:space="preserve">Prepare the </w:t>
       </w:r>
       <w:r>
@@ -3398,6 +3572,105 @@
           <w:sz w:val="20"/>
         </w:rPr>
         <w:t>to regulate Telenet’s 5G solution for BIPT</w:t>
+      </w:r>
+    </w:p>
+    <w:p>
+      <w:pPr>
+        <w:pStyle w:val="ListParagraph"/>
+        <w:numPr>
+          <w:ilvl w:val="2"/>
+          <w:numId w:val="5"/>
+        </w:numPr>
+        <w:spacing w:after="60" w:line="312" w:lineRule="auto"/>
+        <w:contextualSpacing w:val="0"/>
+        <w:jc w:val="both"/>
+        <w:rPr>
+          <w:rFonts w:ascii="Arial" w:hAnsi="Arial" w:cs="Arial"/>
+          <w:sz w:val="20"/>
+        </w:rPr>
+      </w:pPr>
+      <w:r>
+        <w:rPr>
+          <w:rFonts w:ascii="Arial" w:hAnsi="Arial" w:cs="Arial"/>
+          <w:sz w:val="20"/>
+        </w:rPr>
+        <w:t>Introduction of the Data Act European Legislation</w:t>
+      </w:r>
+    </w:p>
+    <w:p>
+      <w:pPr>
+        <w:pStyle w:val="ListParagraph"/>
+        <w:numPr>
+          <w:ilvl w:val="2"/>
+          <w:numId w:val="5"/>
+        </w:numPr>
+        <w:spacing w:after="60" w:line="312" w:lineRule="auto"/>
+        <w:contextualSpacing w:val="0"/>
+        <w:jc w:val="both"/>
+        <w:rPr>
+          <w:rFonts w:ascii="Arial" w:hAnsi="Arial" w:cs="Arial"/>
+          <w:sz w:val="20"/>
+        </w:rPr>
+      </w:pPr>
+      <w:r>
+        <w:rPr>
+          <w:rFonts w:ascii="Arial" w:hAnsi="Arial" w:cs="Arial"/>
+          <w:sz w:val="20"/>
+        </w:rPr>
+        <w:t xml:space="preserve">Manage all Lawful Intercept related projects </w:t>
+      </w:r>
+    </w:p>
+    <w:p>
+      <w:pPr>
+        <w:pStyle w:val="ListParagraph"/>
+        <w:numPr>
+          <w:ilvl w:val="2"/>
+          <w:numId w:val="5"/>
+        </w:numPr>
+        <w:spacing w:after="60" w:line="312" w:lineRule="auto"/>
+        <w:contextualSpacing w:val="0"/>
+        <w:jc w:val="both"/>
+        <w:rPr>
+          <w:rFonts w:ascii="Arial" w:hAnsi="Arial" w:cs="Arial"/>
+          <w:sz w:val="20"/>
+        </w:rPr>
+      </w:pPr>
+      <w:r>
+        <w:rPr>
+          <w:rFonts w:ascii="Arial" w:hAnsi="Arial" w:cs="Arial"/>
+          <w:sz w:val="20"/>
+        </w:rPr>
+        <w:t>Netcracker 2021 contract – Teamed up with Vendor Management to rework the current Netcracker contracts into a new 'Agile' contract moving away from their current Waterfall Way of Working.</w:t>
+      </w:r>
+    </w:p>
+    <w:p>
+      <w:pPr>
+        <w:pStyle w:val="ListParagraph"/>
+        <w:numPr>
+          <w:ilvl w:val="2"/>
+          <w:numId w:val="5"/>
+        </w:numPr>
+        <w:spacing w:after="60" w:line="312" w:lineRule="auto"/>
+        <w:contextualSpacing w:val="0"/>
+        <w:jc w:val="both"/>
+        <w:rPr>
+          <w:rFonts w:ascii="Arial" w:hAnsi="Arial" w:cs="Arial"/>
+          <w:sz w:val="20"/>
+        </w:rPr>
+      </w:pPr>
+      <w:r>
+        <w:rPr>
+          <w:rFonts w:ascii="Arial" w:hAnsi="Arial" w:cs="Arial"/>
+          <w:sz w:val="20"/>
+        </w:rPr>
+        <w:t>I</w:t>
+      </w:r>
+      <w:r>
+        <w:rPr>
+          <w:rFonts w:ascii="Arial" w:hAnsi="Arial" w:cs="Arial"/>
+          <w:sz w:val="20"/>
+        </w:rPr>
+        <w:t>ntroduction of new EECC regulatory requirements for Card Stop and Number Portability</w:t>
       </w:r>
     </w:p>
     <w:p>
@@ -3427,39 +3700,7 @@
           <w:rFonts w:ascii="Arial" w:hAnsi="Arial" w:cs="Arial"/>
           <w:sz w:val="20"/>
         </w:rPr>
-        <w:t xml:space="preserve">End </w:t>
-      </w:r>
-      <w:proofErr w:type="gramStart"/>
-      <w:r>
-        <w:rPr>
-          <w:rFonts w:ascii="Arial" w:hAnsi="Arial" w:cs="Arial"/>
-          <w:sz w:val="20"/>
-        </w:rPr>
-        <w:t>Of</w:t>
-      </w:r>
-      <w:proofErr w:type="gramEnd"/>
-      <w:r>
-        <w:rPr>
-          <w:rFonts w:ascii="Arial" w:hAnsi="Arial" w:cs="Arial"/>
-          <w:sz w:val="20"/>
-        </w:rPr>
-        <w:t xml:space="preserve"> Life / Out </w:t>
-      </w:r>
-      <w:proofErr w:type="gramStart"/>
-      <w:r>
-        <w:rPr>
-          <w:rFonts w:ascii="Arial" w:hAnsi="Arial" w:cs="Arial"/>
-          <w:sz w:val="20"/>
-        </w:rPr>
-        <w:t>Of</w:t>
-      </w:r>
-      <w:proofErr w:type="gramEnd"/>
-      <w:r>
-        <w:rPr>
-          <w:rFonts w:ascii="Arial" w:hAnsi="Arial" w:cs="Arial"/>
-          <w:sz w:val="20"/>
-        </w:rPr>
-        <w:t xml:space="preserve"> Support </w:t>
+        <w:t xml:space="preserve">End Of Life / Out Of Support </w:t>
       </w:r>
       <w:r>
         <w:rPr>
@@ -3510,7 +3751,7 @@
           <w:rFonts w:ascii="Arial" w:hAnsi="Arial" w:cs="Arial"/>
           <w:sz w:val="20"/>
         </w:rPr>
-        <w:t>Netcracker 2021 contract – Teamed up with Vendor Management to rework the</w:t>
+        <w:t>IC2N programme – Manage all activities needed to make our strategic partners</w:t>
       </w:r>
       <w:r>
         <w:rPr>
@@ -3524,7 +3765,7 @@
           <w:rFonts w:ascii="Arial" w:hAnsi="Arial" w:cs="Arial"/>
           <w:sz w:val="20"/>
         </w:rPr>
-        <w:t>current Netcracker</w:t>
+        <w:t>Infosys and</w:t>
       </w:r>
       <w:r>
         <w:rPr>
@@ -3538,42 +3779,21 @@
           <w:rFonts w:ascii="Arial" w:hAnsi="Arial" w:cs="Arial"/>
           <w:sz w:val="20"/>
         </w:rPr>
-        <w:t>contracts into a new 'Agile' contract</w:t>
-      </w:r>
-      <w:r>
-        <w:rPr>
-          <w:rFonts w:ascii="Arial" w:hAnsi="Arial" w:cs="Arial"/>
-          <w:sz w:val="20"/>
-        </w:rPr>
-        <w:t xml:space="preserve"> m</w:t>
-      </w:r>
-      <w:r>
-        <w:rPr>
-          <w:rFonts w:ascii="Arial" w:hAnsi="Arial" w:cs="Arial"/>
-          <w:sz w:val="20"/>
-        </w:rPr>
-        <w:t>o</w:t>
-      </w:r>
-      <w:r>
-        <w:rPr>
-          <w:rFonts w:ascii="Arial" w:hAnsi="Arial" w:cs="Arial"/>
-          <w:sz w:val="20"/>
-        </w:rPr>
-        <w:t>ving</w:t>
-      </w:r>
-      <w:r>
-        <w:rPr>
-          <w:rFonts w:ascii="Arial" w:hAnsi="Arial" w:cs="Arial"/>
-          <w:sz w:val="20"/>
-        </w:rPr>
-        <w:t xml:space="preserve"> away from the</w:t>
-      </w:r>
-      <w:r>
-        <w:rPr>
-          <w:rFonts w:ascii="Arial" w:hAnsi="Arial" w:cs="Arial"/>
-          <w:sz w:val="20"/>
-        </w:rPr>
-        <w:t>ir</w:t>
+        <w:t xml:space="preserve">Cognizant land in the new Telenet Agile Way of Working </w:t>
+      </w:r>
+      <w:r>
+        <w:rPr>
+          <w:rFonts w:ascii="Arial" w:hAnsi="Arial" w:cs="Arial"/>
+          <w:sz w:val="20"/>
+        </w:rPr>
+        <w:t xml:space="preserve">(‘TAWOW’) </w:t>
+      </w:r>
+      <w:r>
+        <w:rPr>
+          <w:rFonts w:ascii="Arial" w:hAnsi="Arial" w:cs="Arial"/>
+          <w:sz w:val="20"/>
+        </w:rPr>
+        <w:t>moving away</w:t>
       </w:r>
       <w:r>
         <w:rPr>
@@ -3587,14 +3807,35 @@
           <w:rFonts w:ascii="Arial" w:hAnsi="Arial" w:cs="Arial"/>
           <w:sz w:val="20"/>
         </w:rPr>
-        <w:t>current Waterfall Way of Working</w:t>
-      </w:r>
-      <w:r>
-        <w:rPr>
-          <w:rFonts w:ascii="Arial" w:hAnsi="Arial" w:cs="Arial"/>
-          <w:sz w:val="20"/>
-        </w:rPr>
-        <w:t>.</w:t>
+        <w:t>from the current</w:t>
+      </w:r>
+      <w:r>
+        <w:rPr>
+          <w:rFonts w:ascii="Arial" w:hAnsi="Arial" w:cs="Arial"/>
+          <w:sz w:val="20"/>
+        </w:rPr>
+        <w:t xml:space="preserve"> w</w:t>
+      </w:r>
+      <w:r>
+        <w:rPr>
+          <w:rFonts w:ascii="Arial" w:hAnsi="Arial" w:cs="Arial"/>
+          <w:sz w:val="20"/>
+        </w:rPr>
+        <w:t>aterfall</w:t>
+      </w:r>
+      <w:r>
+        <w:rPr>
+          <w:rFonts w:ascii="Arial" w:hAnsi="Arial" w:cs="Arial"/>
+          <w:sz w:val="20"/>
+        </w:rPr>
+        <w:t xml:space="preserve"> </w:t>
+      </w:r>
+      <w:r>
+        <w:rPr>
+          <w:rFonts w:ascii="Arial" w:hAnsi="Arial" w:cs="Arial"/>
+          <w:sz w:val="20"/>
+        </w:rPr>
+        <w:t>WoW.</w:t>
       </w:r>
     </w:p>
     <w:p>
@@ -3617,101 +3858,161 @@
           <w:rFonts w:ascii="Arial" w:hAnsi="Arial" w:cs="Arial"/>
           <w:sz w:val="20"/>
         </w:rPr>
-        <w:t>IC2N programme – Manage all activities needed to make our strategic partners</w:t>
-      </w:r>
-      <w:r>
-        <w:rPr>
-          <w:rFonts w:ascii="Arial" w:hAnsi="Arial" w:cs="Arial"/>
-          <w:sz w:val="20"/>
-        </w:rPr>
-        <w:t xml:space="preserve"> </w:t>
-      </w:r>
-      <w:r>
-        <w:rPr>
-          <w:rFonts w:ascii="Arial" w:hAnsi="Arial" w:cs="Arial"/>
-          <w:sz w:val="20"/>
-        </w:rPr>
-        <w:t>Infosys and</w:t>
-      </w:r>
-      <w:r>
-        <w:rPr>
-          <w:rFonts w:ascii="Arial" w:hAnsi="Arial" w:cs="Arial"/>
-          <w:sz w:val="20"/>
-        </w:rPr>
-        <w:t xml:space="preserve"> </w:t>
-      </w:r>
-      <w:r>
-        <w:rPr>
-          <w:rFonts w:ascii="Arial" w:hAnsi="Arial" w:cs="Arial"/>
-          <w:sz w:val="20"/>
-        </w:rPr>
-        <w:t xml:space="preserve">Cognizant land in the new Telenet Agile Way of Working </w:t>
-      </w:r>
-      <w:r>
-        <w:rPr>
-          <w:rFonts w:ascii="Arial" w:hAnsi="Arial" w:cs="Arial"/>
-          <w:sz w:val="20"/>
-        </w:rPr>
-        <w:t xml:space="preserve">(‘TAWOW’) </w:t>
-      </w:r>
-      <w:r>
-        <w:rPr>
-          <w:rFonts w:ascii="Arial" w:hAnsi="Arial" w:cs="Arial"/>
-          <w:sz w:val="20"/>
-        </w:rPr>
-        <w:t>moving away</w:t>
-      </w:r>
-      <w:r>
-        <w:rPr>
-          <w:rFonts w:ascii="Arial" w:hAnsi="Arial" w:cs="Arial"/>
-          <w:sz w:val="20"/>
-        </w:rPr>
-        <w:t xml:space="preserve"> </w:t>
-      </w:r>
-      <w:r>
-        <w:rPr>
-          <w:rFonts w:ascii="Arial" w:hAnsi="Arial" w:cs="Arial"/>
-          <w:sz w:val="20"/>
-        </w:rPr>
-        <w:t>from the current</w:t>
-      </w:r>
-      <w:r>
-        <w:rPr>
-          <w:rFonts w:ascii="Arial" w:hAnsi="Arial" w:cs="Arial"/>
-          <w:sz w:val="20"/>
-        </w:rPr>
-        <w:t xml:space="preserve"> w</w:t>
-      </w:r>
-      <w:r>
-        <w:rPr>
-          <w:rFonts w:ascii="Arial" w:hAnsi="Arial" w:cs="Arial"/>
-          <w:sz w:val="20"/>
-        </w:rPr>
-        <w:t>aterfall</w:t>
-      </w:r>
-      <w:r>
-        <w:rPr>
-          <w:rFonts w:ascii="Arial" w:hAnsi="Arial" w:cs="Arial"/>
-          <w:sz w:val="20"/>
-        </w:rPr>
-        <w:t xml:space="preserve"> </w:t>
-      </w:r>
-      <w:r>
-        <w:rPr>
-          <w:rFonts w:ascii="Arial" w:hAnsi="Arial" w:cs="Arial"/>
-          <w:sz w:val="20"/>
-        </w:rPr>
-        <w:t>WoW.</w:t>
+        <w:t xml:space="preserve">Popeye </w:t>
+      </w:r>
+      <w:r>
+        <w:rPr>
+          <w:rFonts w:ascii="Arial" w:hAnsi="Arial" w:cs="Arial"/>
+          <w:sz w:val="20"/>
+        </w:rPr>
+        <w:t xml:space="preserve">transition </w:t>
+      </w:r>
+      <w:r>
+        <w:rPr>
+          <w:rFonts w:ascii="Arial" w:hAnsi="Arial" w:cs="Arial"/>
+          <w:sz w:val="20"/>
+        </w:rPr>
+        <w:t>program</w:t>
+      </w:r>
+      <w:r>
+        <w:rPr>
+          <w:rFonts w:ascii="Arial" w:hAnsi="Arial" w:cs="Arial"/>
+          <w:sz w:val="20"/>
+        </w:rPr>
+        <w:t>me</w:t>
+      </w:r>
+      <w:r>
+        <w:rPr>
+          <w:rFonts w:ascii="Arial" w:hAnsi="Arial" w:cs="Arial"/>
+          <w:sz w:val="20"/>
+        </w:rPr>
+        <w:t xml:space="preserve"> – Managed the transition of 85+ Digital and Data resources and </w:t>
+      </w:r>
+      <w:r>
+        <w:rPr>
+          <w:rFonts w:ascii="Arial" w:hAnsi="Arial" w:cs="Arial"/>
+          <w:sz w:val="20"/>
+        </w:rPr>
+        <w:br/>
+        <w:t>3</w:t>
+      </w:r>
+      <w:r>
+        <w:rPr>
+          <w:rFonts w:ascii="Arial" w:hAnsi="Arial" w:cs="Arial"/>
+          <w:sz w:val="20"/>
+        </w:rPr>
+        <w:t xml:space="preserve">5+ legacy BSS / OSS applications of several incumbent partners to two main future partners Infosys </w:t>
+      </w:r>
+      <w:r>
+        <w:rPr>
+          <w:rFonts w:ascii="Arial" w:hAnsi="Arial" w:cs="Arial"/>
+          <w:sz w:val="20"/>
+        </w:rPr>
+        <w:t xml:space="preserve">(for Development and Support) </w:t>
+      </w:r>
+      <w:r>
+        <w:rPr>
+          <w:rFonts w:ascii="Arial" w:hAnsi="Arial" w:cs="Arial"/>
+          <w:sz w:val="20"/>
+        </w:rPr>
+        <w:t>and Cognizant</w:t>
+      </w:r>
+      <w:r>
+        <w:rPr>
+          <w:rFonts w:ascii="Arial" w:hAnsi="Arial" w:cs="Arial"/>
+          <w:sz w:val="20"/>
+        </w:rPr>
+        <w:t xml:space="preserve"> (for </w:t>
+      </w:r>
+      <w:r>
+        <w:rPr>
+          <w:rFonts w:ascii="Arial" w:hAnsi="Arial" w:cs="Arial"/>
+          <w:sz w:val="20"/>
+        </w:rPr>
+        <w:t>T</w:t>
+      </w:r>
+      <w:r>
+        <w:rPr>
+          <w:rFonts w:ascii="Arial" w:hAnsi="Arial" w:cs="Arial"/>
+          <w:sz w:val="20"/>
+        </w:rPr>
+        <w:t>esting)</w:t>
+      </w:r>
+      <w:r>
+        <w:rPr>
+          <w:rFonts w:ascii="Arial" w:hAnsi="Arial" w:cs="Arial"/>
+          <w:sz w:val="20"/>
+        </w:rPr>
+        <w:t>. This program</w:t>
+      </w:r>
+      <w:r>
+        <w:rPr>
+          <w:rFonts w:ascii="Arial" w:hAnsi="Arial" w:cs="Arial"/>
+          <w:sz w:val="20"/>
+        </w:rPr>
+        <w:t>me</w:t>
+      </w:r>
+      <w:r>
+        <w:rPr>
+          <w:rFonts w:ascii="Arial" w:hAnsi="Arial" w:cs="Arial"/>
+          <w:sz w:val="20"/>
+        </w:rPr>
+        <w:t xml:space="preserve"> aim</w:t>
+      </w:r>
+      <w:r>
+        <w:rPr>
+          <w:rFonts w:ascii="Arial" w:hAnsi="Arial" w:cs="Arial"/>
+          <w:sz w:val="20"/>
+        </w:rPr>
+        <w:t>ed</w:t>
+      </w:r>
+      <w:r>
+        <w:rPr>
+          <w:rFonts w:ascii="Arial" w:hAnsi="Arial" w:cs="Arial"/>
+          <w:sz w:val="20"/>
+        </w:rPr>
+        <w:t xml:space="preserve"> to save 3</w:t>
+      </w:r>
+      <w:r>
+        <w:rPr>
+          <w:rFonts w:ascii="Arial" w:hAnsi="Arial" w:cs="Arial"/>
+          <w:sz w:val="20"/>
+        </w:rPr>
+        <w:t>3</w:t>
+      </w:r>
+      <w:r>
+        <w:rPr>
+          <w:rFonts w:ascii="Arial" w:hAnsi="Arial" w:cs="Arial"/>
+          <w:sz w:val="20"/>
+        </w:rPr>
+        <w:t>+</w:t>
+      </w:r>
+      <w:r>
+        <w:rPr>
+          <w:rFonts w:ascii="Arial" w:hAnsi="Arial" w:cs="Arial"/>
+          <w:sz w:val="20"/>
+        </w:rPr>
+        <w:t xml:space="preserve"> mio€ CAPEX over 5 years.</w:t>
+      </w:r>
+      <w:r>
+        <w:rPr>
+          <w:rFonts w:ascii="Arial" w:hAnsi="Arial" w:cs="Arial"/>
+          <w:sz w:val="20"/>
+        </w:rPr>
+        <w:t xml:space="preserve"> Reporting to the CTO and occasionally to the SLT of Telenet.</w:t>
       </w:r>
     </w:p>
     <w:p>
       <w:pPr>
         <w:pStyle w:val="ListParagraph"/>
+        <w:keepNext/>
+        <w:keepLines/>
         <w:numPr>
           <w:ilvl w:val="1"/>
           <w:numId w:val="5"/>
         </w:numPr>
         <w:spacing w:after="60" w:line="312" w:lineRule="auto"/>
+        <w:ind w:hanging="357"/>
         <w:contextualSpacing w:val="0"/>
         <w:jc w:val="both"/>
         <w:rPr>
@@ -3724,85 +4025,15 @@
           <w:rFonts w:ascii="Arial" w:hAnsi="Arial" w:cs="Arial"/>
           <w:sz w:val="20"/>
         </w:rPr>
-        <w:t>Popeye program</w:t>
-      </w:r>
-      <w:r>
-        <w:rPr>
-          <w:rFonts w:ascii="Arial" w:hAnsi="Arial" w:cs="Arial"/>
-          <w:sz w:val="20"/>
-        </w:rPr>
-        <w:t>me</w:t>
-      </w:r>
-      <w:r>
-        <w:rPr>
-          <w:rFonts w:ascii="Arial" w:hAnsi="Arial" w:cs="Arial"/>
-          <w:sz w:val="20"/>
-        </w:rPr>
-        <w:t xml:space="preserve"> – Managed the transition of 85+ Digital and Data resources and </w:t>
-      </w:r>
-      <w:r>
-        <w:rPr>
-          <w:rFonts w:ascii="Arial" w:hAnsi="Arial" w:cs="Arial"/>
-          <w:sz w:val="20"/>
-        </w:rPr>
-        <w:br/>
-        <w:t>3</w:t>
-      </w:r>
-      <w:r>
-        <w:rPr>
-          <w:rFonts w:ascii="Arial" w:hAnsi="Arial" w:cs="Arial"/>
-          <w:sz w:val="20"/>
-        </w:rPr>
-        <w:t xml:space="preserve">5+ legacy BSS / OSS applications of several incumbent partners to two main future partners Infosys </w:t>
-      </w:r>
-      <w:r>
-        <w:rPr>
-          <w:rFonts w:ascii="Arial" w:hAnsi="Arial" w:cs="Arial"/>
-          <w:sz w:val="20"/>
-        </w:rPr>
-        <w:t xml:space="preserve">(for Development and Support) </w:t>
-      </w:r>
-      <w:r>
-        <w:rPr>
-          <w:rFonts w:ascii="Arial" w:hAnsi="Arial" w:cs="Arial"/>
-          <w:sz w:val="20"/>
-        </w:rPr>
-        <w:t>and Cognizant</w:t>
-      </w:r>
-      <w:r>
-        <w:rPr>
-          <w:rFonts w:ascii="Arial" w:hAnsi="Arial" w:cs="Arial"/>
-          <w:sz w:val="20"/>
-        </w:rPr>
-        <w:t xml:space="preserve"> (for </w:t>
-      </w:r>
-      <w:r>
-        <w:rPr>
-          <w:rFonts w:ascii="Arial" w:hAnsi="Arial" w:cs="Arial"/>
-          <w:sz w:val="20"/>
-        </w:rPr>
-        <w:t>T</w:t>
-      </w:r>
-      <w:r>
-        <w:rPr>
-          <w:rFonts w:ascii="Arial" w:hAnsi="Arial" w:cs="Arial"/>
-          <w:sz w:val="20"/>
-        </w:rPr>
-        <w:t>esting)</w:t>
-      </w:r>
-      <w:r>
-        <w:rPr>
-          <w:rFonts w:ascii="Arial" w:hAnsi="Arial" w:cs="Arial"/>
-          <w:sz w:val="20"/>
-        </w:rPr>
-        <w:t>. This program</w:t>
-      </w:r>
-      <w:r>
-        <w:rPr>
-          <w:rFonts w:ascii="Arial" w:hAnsi="Arial" w:cs="Arial"/>
-          <w:sz w:val="20"/>
-        </w:rPr>
-        <w:t>me</w:t>
+        <w:lastRenderedPageBreak/>
+        <w:t xml:space="preserve">Dependencies on Commercial WholeSale </w:t>
+      </w:r>
+      <w:r>
+        <w:rPr>
+          <w:rFonts w:ascii="Arial" w:hAnsi="Arial" w:cs="Arial"/>
+          <w:sz w:val="20"/>
+        </w:rPr>
+        <w:t>(‘DoC WHS’)</w:t>
       </w:r>
       <w:r>
         <w:rPr>
@@ -3811,135 +4042,25 @@
         </w:rPr>
         <w:t xml:space="preserve"> </w:t>
       </w:r>
-      <w:proofErr w:type="gramStart"/>
-      <w:r>
-        <w:rPr>
-          <w:rFonts w:ascii="Arial" w:hAnsi="Arial" w:cs="Arial"/>
-          <w:sz w:val="20"/>
-        </w:rPr>
-        <w:t>aim</w:t>
-      </w:r>
-      <w:r>
-        <w:rPr>
-          <w:rFonts w:ascii="Arial" w:hAnsi="Arial" w:cs="Arial"/>
-          <w:sz w:val="20"/>
-        </w:rPr>
-        <w:t>ed</w:t>
-      </w:r>
-      <w:proofErr w:type="gramEnd"/>
-      <w:r>
-        <w:rPr>
-          <w:rFonts w:ascii="Arial" w:hAnsi="Arial" w:cs="Arial"/>
-          <w:sz w:val="20"/>
-        </w:rPr>
-        <w:t xml:space="preserve"> to save 3</w:t>
-      </w:r>
-      <w:r>
-        <w:rPr>
-          <w:rFonts w:ascii="Arial" w:hAnsi="Arial" w:cs="Arial"/>
-          <w:sz w:val="20"/>
-        </w:rPr>
-        <w:t>3</w:t>
-      </w:r>
-      <w:r>
-        <w:rPr>
-          <w:rFonts w:ascii="Arial" w:hAnsi="Arial" w:cs="Arial"/>
-          <w:sz w:val="20"/>
-        </w:rPr>
-        <w:t>+</w:t>
-      </w:r>
-      <w:r>
-        <w:rPr>
-          <w:rFonts w:ascii="Arial" w:hAnsi="Arial" w:cs="Arial"/>
-          <w:sz w:val="20"/>
-        </w:rPr>
-        <w:t xml:space="preserve"> mio€ CAPEX over 5 years.</w:t>
-      </w:r>
-      <w:r>
-        <w:rPr>
-          <w:rFonts w:ascii="Arial" w:hAnsi="Arial" w:cs="Arial"/>
-          <w:sz w:val="20"/>
-        </w:rPr>
-        <w:t xml:space="preserve"> Reporting to the CTO and occasionally to the SLT of Telenet.</w:t>
+      <w:r>
+        <w:rPr>
+          <w:rFonts w:ascii="Arial" w:hAnsi="Arial" w:cs="Arial"/>
+          <w:sz w:val="20"/>
+        </w:rPr>
+        <w:t>programme</w:t>
       </w:r>
     </w:p>
     <w:p>
       <w:pPr>
         <w:pStyle w:val="ListParagraph"/>
-        <w:numPr>
-          <w:ilvl w:val="1"/>
-          <w:numId w:val="5"/>
-        </w:numPr>
-        <w:spacing w:after="60" w:line="312" w:lineRule="auto"/>
-        <w:contextualSpacing w:val="0"/>
-        <w:jc w:val="both"/>
-        <w:rPr>
-          <w:rFonts w:ascii="Arial" w:hAnsi="Arial" w:cs="Arial"/>
-          <w:sz w:val="20"/>
-        </w:rPr>
-      </w:pPr>
-      <w:proofErr w:type="gramStart"/>
-      <w:r>
-        <w:rPr>
-          <w:rFonts w:ascii="Arial" w:hAnsi="Arial" w:cs="Arial"/>
-          <w:sz w:val="20"/>
-        </w:rPr>
-        <w:t>Dependencies</w:t>
-      </w:r>
-      <w:proofErr w:type="gramEnd"/>
-      <w:r>
-        <w:rPr>
-          <w:rFonts w:ascii="Arial" w:hAnsi="Arial" w:cs="Arial"/>
-          <w:sz w:val="20"/>
-        </w:rPr>
-        <w:t xml:space="preserve"> on Commercial </w:t>
-      </w:r>
-      <w:proofErr w:type="gramStart"/>
-      <w:r>
-        <w:rPr>
-          <w:rFonts w:ascii="Arial" w:hAnsi="Arial" w:cs="Arial"/>
-          <w:sz w:val="20"/>
-        </w:rPr>
-        <w:t xml:space="preserve">WholeSale </w:t>
-      </w:r>
-      <w:r>
-        <w:rPr>
-          <w:rFonts w:ascii="Arial" w:hAnsi="Arial" w:cs="Arial"/>
-          <w:sz w:val="20"/>
-        </w:rPr>
-        <w:t>(‘</w:t>
-      </w:r>
-      <w:proofErr w:type="gramEnd"/>
-      <w:r>
-        <w:rPr>
-          <w:rFonts w:ascii="Arial" w:hAnsi="Arial" w:cs="Arial"/>
-          <w:sz w:val="20"/>
-        </w:rPr>
-        <w:t>DoC WHS’)</w:t>
-      </w:r>
-      <w:r>
-        <w:rPr>
-          <w:rFonts w:ascii="Arial" w:hAnsi="Arial" w:cs="Arial"/>
-          <w:sz w:val="20"/>
-        </w:rPr>
-        <w:t xml:space="preserve"> </w:t>
-      </w:r>
-      <w:r>
-        <w:rPr>
-          <w:rFonts w:ascii="Arial" w:hAnsi="Arial" w:cs="Arial"/>
-          <w:sz w:val="20"/>
-        </w:rPr>
-        <w:t>programme</w:t>
-      </w:r>
-    </w:p>
-    <w:p>
-      <w:pPr>
-        <w:pStyle w:val="ListParagraph"/>
+        <w:keepNext/>
+        <w:keepLines/>
         <w:numPr>
           <w:ilvl w:val="2"/>
           <w:numId w:val="5"/>
         </w:numPr>
         <w:spacing w:after="60" w:line="312" w:lineRule="auto"/>
+        <w:ind w:hanging="357"/>
         <w:contextualSpacing w:val="0"/>
         <w:jc w:val="both"/>
         <w:rPr>
@@ -4091,11 +4212,14 @@
     <w:p>
       <w:pPr>
         <w:pStyle w:val="ListParagraph"/>
+        <w:keepNext/>
+        <w:keepLines/>
         <w:numPr>
           <w:ilvl w:val="2"/>
           <w:numId w:val="5"/>
         </w:numPr>
         <w:spacing w:after="60" w:line="312" w:lineRule="auto"/>
+        <w:ind w:hanging="357"/>
         <w:contextualSpacing w:val="0"/>
         <w:jc w:val="both"/>
         <w:rPr>
@@ -4178,24 +4302,7 @@
           <w:rFonts w:ascii="Arial" w:hAnsi="Arial" w:cs="Arial"/>
           <w:sz w:val="20"/>
         </w:rPr>
-        <w:t xml:space="preserve">migration of Base </w:t>
-      </w:r>
-      <w:proofErr w:type="gramStart"/>
-      <w:r>
-        <w:rPr>
-          <w:rFonts w:ascii="Arial" w:hAnsi="Arial" w:cs="Arial"/>
-          <w:sz w:val="20"/>
-        </w:rPr>
-        <w:lastRenderedPageBreak/>
-        <w:t>Pre Paid</w:t>
-      </w:r>
-      <w:proofErr w:type="gramEnd"/>
-      <w:r>
-        <w:rPr>
-          <w:rFonts w:ascii="Arial" w:hAnsi="Arial" w:cs="Arial"/>
-          <w:sz w:val="20"/>
-        </w:rPr>
-        <w:t>, Post Paid and B2B customers to the new integrated</w:t>
+        <w:t>migration of Base Pre Paid, Post Paid and B2B customers to the new integrated</w:t>
       </w:r>
       <w:r>
         <w:rPr>
@@ -4209,39 +4316,14 @@
           <w:rFonts w:ascii="Arial" w:hAnsi="Arial" w:cs="Arial"/>
           <w:sz w:val="20"/>
         </w:rPr>
-        <w:t xml:space="preserve">Telenet / BASE IT </w:t>
-      </w:r>
-      <w:proofErr w:type="gramStart"/>
-      <w:r>
-        <w:rPr>
-          <w:rFonts w:ascii="Arial" w:hAnsi="Arial" w:cs="Arial"/>
-          <w:sz w:val="20"/>
-        </w:rPr>
-        <w:t>stack (‘</w:t>
-      </w:r>
-      <w:proofErr w:type="gramEnd"/>
-      <w:r>
-        <w:rPr>
-          <w:rFonts w:ascii="Arial" w:hAnsi="Arial" w:cs="Arial"/>
-          <w:sz w:val="20"/>
-        </w:rPr>
-        <w:t xml:space="preserve">Origin’). This programme </w:t>
-      </w:r>
-      <w:proofErr w:type="gramStart"/>
-      <w:r>
-        <w:rPr>
-          <w:rFonts w:ascii="Arial" w:hAnsi="Arial" w:cs="Arial"/>
-          <w:sz w:val="20"/>
-        </w:rPr>
-        <w:t>realized</w:t>
-      </w:r>
-      <w:proofErr w:type="gramEnd"/>
-      <w:r>
-        <w:rPr>
-          <w:rFonts w:ascii="Arial" w:hAnsi="Arial" w:cs="Arial"/>
-          <w:sz w:val="20"/>
-        </w:rPr>
-        <w:t xml:space="preserve"> </w:t>
+        <w:t xml:space="preserve">Telenet / BASE IT stack (‘Origin’). This programme </w:t>
+      </w:r>
+      <w:r>
+        <w:rPr>
+          <w:rFonts w:ascii="Arial" w:hAnsi="Arial" w:cs="Arial"/>
+          <w:sz w:val="20"/>
+        </w:rPr>
+        <w:t xml:space="preserve">realized </w:t>
       </w:r>
       <w:r>
         <w:rPr>
@@ -4369,27 +4451,6 @@
           <w:rFonts w:ascii="Arial" w:hAnsi="Arial" w:cs="Arial"/>
           <w:sz w:val="20"/>
         </w:rPr>
-        <w:t>Telenet – introduc</w:t>
-      </w:r>
-      <w:r>
-        <w:rPr>
-          <w:rFonts w:ascii="Arial" w:hAnsi="Arial" w:cs="Arial"/>
-          <w:sz w:val="20"/>
-        </w:rPr>
-        <w:t xml:space="preserve">tion of </w:t>
-      </w:r>
-      <w:r>
-        <w:rPr>
-          <w:rFonts w:ascii="Arial" w:hAnsi="Arial" w:cs="Arial"/>
-          <w:sz w:val="20"/>
-        </w:rPr>
-        <w:t xml:space="preserve">new EECC regulatory requirements for Card Stop and Number Portability, </w:t>
-      </w:r>
-      <w:r>
-        <w:rPr>
-          <w:rFonts w:ascii="Arial" w:hAnsi="Arial" w:cs="Arial"/>
-          <w:sz w:val="20"/>
-        </w:rPr>
         <w:t>Telenet</w:t>
       </w:r>
       <w:r>
@@ -4742,7 +4803,6 @@
           <w:szCs w:val="19"/>
         </w:rPr>
       </w:pPr>
-      <w:proofErr w:type="gramStart"/>
       <w:r>
         <w:rPr>
           <w:rFonts w:ascii="Arial" w:hAnsi="Arial" w:cs="Arial"/>
@@ -4751,9 +4811,8 @@
           <w:sz w:val="20"/>
           <w:szCs w:val="19"/>
         </w:rPr>
-        <w:t>PEOPLE</w:t>
-      </w:r>
-      <w:proofErr w:type="gramEnd"/>
+        <w:t xml:space="preserve">PEOPLE MANAGER / </w:t>
+      </w:r>
       <w:r>
         <w:rPr>
           <w:rFonts w:ascii="Arial" w:hAnsi="Arial" w:cs="Arial"/>
@@ -4762,39 +4821,7 @@
           <w:sz w:val="20"/>
           <w:szCs w:val="19"/>
         </w:rPr>
-        <w:t xml:space="preserve"> MANAGER / </w:t>
-      </w:r>
-      <w:r>
-        <w:rPr>
-          <w:rFonts w:ascii="Arial" w:hAnsi="Arial" w:cs="Arial"/>
-          <w:b/>
-          <w:i/>
-          <w:sz w:val="20"/>
-          <w:szCs w:val="19"/>
-        </w:rPr>
-        <w:t xml:space="preserve">TEAM LEADER / PROFESSIONAL </w:t>
-      </w:r>
-      <w:proofErr w:type="gramStart"/>
-      <w:r>
-        <w:rPr>
-          <w:rFonts w:ascii="Arial" w:hAnsi="Arial" w:cs="Arial"/>
-          <w:b/>
-          <w:i/>
-          <w:sz w:val="20"/>
-          <w:szCs w:val="19"/>
-        </w:rPr>
-        <w:t>SERVICES</w:t>
-      </w:r>
-      <w:proofErr w:type="gramEnd"/>
-      <w:r>
-        <w:rPr>
-          <w:rFonts w:ascii="Arial" w:hAnsi="Arial" w:cs="Arial"/>
-          <w:b/>
-          <w:i/>
-          <w:sz w:val="20"/>
-          <w:szCs w:val="19"/>
-        </w:rPr>
-        <w:t xml:space="preserve"> MANAGER</w:t>
+        <w:t>TEAM LEADER / PROFESSIONAL SERVICES MANAGER</w:t>
       </w:r>
     </w:p>
     <w:p>
@@ -4925,23 +4952,7 @@
           <w:rFonts w:ascii="Arial" w:hAnsi="Arial" w:cs="Arial"/>
           <w:sz w:val="20"/>
         </w:rPr>
-        <w:t xml:space="preserve">Responsible for Hiring, Training, Firing, Communicating, Organizing, Controlling, Planning and Evaluating of </w:t>
-      </w:r>
-      <w:proofErr w:type="gramStart"/>
-      <w:r>
-        <w:rPr>
-          <w:rFonts w:ascii="Arial" w:hAnsi="Arial" w:cs="Arial"/>
-          <w:sz w:val="20"/>
-        </w:rPr>
-        <w:t>above</w:t>
-      </w:r>
-      <w:proofErr w:type="gramEnd"/>
-      <w:r>
-        <w:rPr>
-          <w:rFonts w:ascii="Arial" w:hAnsi="Arial" w:cs="Arial"/>
-          <w:sz w:val="20"/>
-        </w:rPr>
-        <w:t xml:space="preserve"> teams</w:t>
+        <w:t>Responsible for Hiring, Training, Firing, Communicating, Organizing, Controlling, Planning and Evaluating of above teams</w:t>
       </w:r>
       <w:r>
         <w:rPr>
@@ -5087,30 +5098,14 @@
           <w:rFonts w:ascii="Arial" w:hAnsi="Arial" w:cs="Arial"/>
           <w:sz w:val="20"/>
         </w:rPr>
-        <w:t xml:space="preserve">understand the current business </w:t>
-      </w:r>
-      <w:proofErr w:type="gramStart"/>
-      <w:r>
-        <w:rPr>
-          <w:rFonts w:ascii="Arial" w:hAnsi="Arial" w:cs="Arial"/>
-          <w:sz w:val="20"/>
-        </w:rPr>
-        <w:t xml:space="preserve">needs </w:t>
-      </w:r>
-      <w:r>
-        <w:rPr>
-          <w:rFonts w:ascii="Arial" w:hAnsi="Arial" w:cs="Arial"/>
-          <w:sz w:val="20"/>
-        </w:rPr>
-        <w:t>/</w:t>
-      </w:r>
-      <w:proofErr w:type="gramEnd"/>
-      <w:r>
-        <w:rPr>
-          <w:rFonts w:ascii="Arial" w:hAnsi="Arial" w:cs="Arial"/>
-          <w:sz w:val="20"/>
-        </w:rPr>
-        <w:t xml:space="preserve"> issues </w:t>
+        <w:t xml:space="preserve">understand the current business needs </w:t>
+      </w:r>
+      <w:r>
+        <w:rPr>
+          <w:rFonts w:ascii="Arial" w:hAnsi="Arial" w:cs="Arial"/>
+          <w:sz w:val="20"/>
+        </w:rPr>
+        <w:t xml:space="preserve">/ issues </w:t>
       </w:r>
       <w:r>
         <w:rPr>
@@ -5155,39 +5150,7 @@
           <w:rFonts w:ascii="Arial" w:hAnsi="Arial" w:cs="Arial"/>
           <w:sz w:val="20"/>
         </w:rPr>
-        <w:t xml:space="preserve">, provide shadowing opportunities, </w:t>
-      </w:r>
-      <w:proofErr w:type="gramStart"/>
-      <w:r>
-        <w:rPr>
-          <w:rFonts w:ascii="Arial" w:hAnsi="Arial" w:cs="Arial"/>
-          <w:sz w:val="20"/>
-        </w:rPr>
-        <w:t>ensured</w:t>
-      </w:r>
-      <w:proofErr w:type="gramEnd"/>
-      <w:r>
-        <w:rPr>
-          <w:rFonts w:ascii="Arial" w:hAnsi="Arial" w:cs="Arial"/>
-          <w:sz w:val="20"/>
-        </w:rPr>
-        <w:t xml:space="preserve"> </w:t>
-      </w:r>
-      <w:proofErr w:type="gramStart"/>
-      <w:r>
-        <w:rPr>
-          <w:rFonts w:ascii="Arial" w:hAnsi="Arial" w:cs="Arial"/>
-          <w:sz w:val="20"/>
-        </w:rPr>
-        <w:t>backlog</w:t>
-      </w:r>
-      <w:proofErr w:type="gramEnd"/>
-      <w:r>
-        <w:rPr>
-          <w:rFonts w:ascii="Arial" w:hAnsi="Arial" w:cs="Arial"/>
-          <w:sz w:val="20"/>
-        </w:rPr>
-        <w:t xml:space="preserve"> was controlled</w:t>
+        <w:t>, provide shadowing opportunities, ensured backlog was controlled</w:t>
       </w:r>
       <w:r>
         <w:rPr>
@@ -5218,30 +5181,14 @@
           <w:rFonts w:ascii="Arial" w:hAnsi="Arial" w:cs="Arial"/>
           <w:sz w:val="20"/>
         </w:rPr>
-        <w:t xml:space="preserve">Key customers </w:t>
-      </w:r>
-      <w:proofErr w:type="gramStart"/>
-      <w:r>
-        <w:rPr>
-          <w:rFonts w:ascii="Arial" w:hAnsi="Arial" w:cs="Arial"/>
-          <w:sz w:val="20"/>
-        </w:rPr>
-        <w:t xml:space="preserve">included </w:t>
-      </w:r>
-      <w:r>
-        <w:rPr>
-          <w:rFonts w:ascii="Arial" w:hAnsi="Arial" w:cs="Arial"/>
-          <w:sz w:val="20"/>
-        </w:rPr>
-        <w:t>were</w:t>
-      </w:r>
-      <w:proofErr w:type="gramEnd"/>
-      <w:r>
-        <w:rPr>
-          <w:rFonts w:ascii="Arial" w:hAnsi="Arial" w:cs="Arial"/>
-          <w:sz w:val="20"/>
-        </w:rPr>
-        <w:t xml:space="preserve"> </w:t>
+        <w:t xml:space="preserve">Key customers included </w:t>
+      </w:r>
+      <w:r>
+        <w:rPr>
+          <w:rFonts w:ascii="Arial" w:hAnsi="Arial" w:cs="Arial"/>
+          <w:sz w:val="20"/>
+        </w:rPr>
+        <w:t xml:space="preserve">were </w:t>
       </w:r>
       <w:r>
         <w:rPr>
@@ -5363,6 +5310,7 @@
           <w:sz w:val="20"/>
           <w:szCs w:val="19"/>
         </w:rPr>
+        <w:lastRenderedPageBreak/>
         <w:t>BUSINESS DEVELOPMENT</w:t>
       </w:r>
       <w:r>
@@ -5504,24 +5452,7 @@
           <w:rFonts w:ascii="Arial" w:hAnsi="Arial" w:cs="Arial"/>
           <w:sz w:val="20"/>
         </w:rPr>
-        <w:lastRenderedPageBreak/>
-        <w:t xml:space="preserve">Worked with NetApp partners to ensure joined customer successes through common </w:t>
-      </w:r>
-      <w:proofErr w:type="gramStart"/>
-      <w:r>
-        <w:rPr>
-          <w:rFonts w:ascii="Arial" w:hAnsi="Arial" w:cs="Arial"/>
-          <w:sz w:val="20"/>
-        </w:rPr>
-        <w:t>engagements (‘</w:t>
-      </w:r>
-      <w:proofErr w:type="gramEnd"/>
-      <w:r>
-        <w:rPr>
-          <w:rFonts w:ascii="Arial" w:hAnsi="Arial" w:cs="Arial"/>
-          <w:sz w:val="20"/>
-        </w:rPr>
-        <w:t>Design - Execute - Verify’ methodology)</w:t>
+        <w:t>Worked with NetApp partners to ensure joined customer successes through common engagements (‘Design - Execute - Verify’ methodology)</w:t>
       </w:r>
       <w:r>
         <w:rPr>
@@ -5822,17 +5753,8 @@
           <w:rFonts w:ascii="Arial" w:hAnsi="Arial" w:cs="Arial"/>
           <w:sz w:val="20"/>
         </w:rPr>
-        <w:t xml:space="preserve">Leadership and </w:t>
-      </w:r>
-      <w:proofErr w:type="gramStart"/>
-      <w:r>
-        <w:rPr>
-          <w:rFonts w:ascii="Arial" w:hAnsi="Arial" w:cs="Arial"/>
-          <w:sz w:val="20"/>
-        </w:rPr>
-        <w:t>vision</w:t>
-      </w:r>
-      <w:proofErr w:type="gramEnd"/>
+        <w:t>Leadership and vision</w:t>
+      </w:r>
       <w:r>
         <w:rPr>
           <w:rFonts w:ascii="Arial" w:hAnsi="Arial" w:cs="Arial"/>
@@ -6309,9 +6231,6 @@
           <w:tab w:val="left" w:pos="8337"/>
         </w:tabs>
       </w:pPr>
-      <w:r>
-        <w:tab/>
-      </w:r>
     </w:p>
     <w:p>
       <w:pPr>
@@ -6403,7 +6322,6 @@
         </w:rPr>
         <w:t xml:space="preserve"> </w:t>
       </w:r>
-      <w:proofErr w:type="gramStart"/>
       <w:r>
         <w:rPr>
           <w:rFonts w:ascii="Arial" w:hAnsi="Arial" w:cs="Arial"/>
@@ -6422,9 +6340,8 @@
           <w:szCs w:val="20"/>
           <w:lang w:val="nl-BE"/>
         </w:rPr>
-        <w:t>s /</w:t>
-      </w:r>
-      <w:proofErr w:type="gramEnd"/>
+        <w:t xml:space="preserve">s / </w:t>
+      </w:r>
       <w:r>
         <w:rPr>
           <w:rFonts w:ascii="Arial" w:hAnsi="Arial" w:cs="Arial"/>
@@ -6433,7 +6350,7 @@
           <w:szCs w:val="20"/>
           <w:lang w:val="nl-BE"/>
         </w:rPr>
-        <w:t xml:space="preserve"> </w:t>
+        <w:t>Industrieel Ingenieur Elektronica</w:t>
       </w:r>
       <w:r>
         <w:rPr>
@@ -6443,7 +6360,7 @@
           <w:szCs w:val="20"/>
           <w:lang w:val="nl-BE"/>
         </w:rPr>
-        <w:t>Industrieel Ingenieur Elektronica</w:t>
+        <w:t xml:space="preserve"> (</w:t>
       </w:r>
       <w:r>
         <w:rPr>
@@ -6453,7 +6370,7 @@
           <w:szCs w:val="20"/>
           <w:lang w:val="nl-BE"/>
         </w:rPr>
-        <w:t xml:space="preserve"> (</w:t>
+        <w:t>HW-engineering</w:t>
       </w:r>
       <w:r>
         <w:rPr>
@@ -6463,17 +6380,91 @@
           <w:szCs w:val="20"/>
           <w:lang w:val="nl-BE"/>
         </w:rPr>
-        <w:t>HW-engineering</w:t>
-      </w:r>
-      <w:r>
-        <w:rPr>
-          <w:rFonts w:ascii="Arial" w:hAnsi="Arial" w:cs="Arial"/>
-          <w:b/>
+        <w:t>)</w:t>
+      </w:r>
+    </w:p>
+    <w:p>
+      <w:pPr>
+        <w:pStyle w:val="DefaultText"/>
+        <w:jc w:val="center"/>
+        <w:rPr>
+          <w:rFonts w:ascii="Arial" w:hAnsi="Arial" w:cs="Arial"/>
           <w:sz w:val="20"/>
           <w:szCs w:val="20"/>
           <w:lang w:val="nl-BE"/>
         </w:rPr>
-        <w:t>)</w:t>
+      </w:pPr>
+      <w:r>
+        <w:rPr>
+          <w:rFonts w:ascii="Arial" w:hAnsi="Arial" w:cs="Arial"/>
+          <w:sz w:val="20"/>
+          <w:szCs w:val="20"/>
+          <w:lang w:val="nl-BE"/>
+        </w:rPr>
+        <w:t>Stedeli</w:t>
+      </w:r>
+      <w:r>
+        <w:rPr>
+          <w:rFonts w:ascii="Arial" w:hAnsi="Arial" w:cs="Arial"/>
+          <w:sz w:val="20"/>
+          <w:szCs w:val="20"/>
+          <w:lang w:val="nl-BE"/>
+        </w:rPr>
+        <w:t>j</w:t>
+      </w:r>
+      <w:r>
+        <w:rPr>
+          <w:rFonts w:ascii="Arial" w:hAnsi="Arial" w:cs="Arial"/>
+          <w:sz w:val="20"/>
+          <w:szCs w:val="20"/>
+          <w:lang w:val="nl-BE"/>
+        </w:rPr>
+        <w:t xml:space="preserve">ke </w:t>
+      </w:r>
+      <w:r>
+        <w:rPr>
+          <w:rFonts w:ascii="Arial" w:hAnsi="Arial" w:cs="Arial"/>
+          <w:sz w:val="20"/>
+          <w:szCs w:val="20"/>
+          <w:lang w:val="nl-BE"/>
+        </w:rPr>
+        <w:t xml:space="preserve">Industriele </w:t>
+      </w:r>
+      <w:r>
+        <w:rPr>
+          <w:rFonts w:ascii="Arial" w:hAnsi="Arial" w:cs="Arial"/>
+          <w:sz w:val="20"/>
+          <w:szCs w:val="20"/>
+          <w:lang w:val="nl-BE"/>
+        </w:rPr>
+        <w:t>Hogeschool Antwerpen</w:t>
+      </w:r>
+      <w:r>
+        <w:rPr>
+          <w:rFonts w:ascii="Arial" w:hAnsi="Arial" w:cs="Arial"/>
+          <w:sz w:val="20"/>
+          <w:szCs w:val="20"/>
+          <w:lang w:val="nl-BE"/>
+        </w:rPr>
+        <w:t xml:space="preserve">, </w:t>
+      </w:r>
+      <w:r>
+        <w:rPr>
+          <w:rFonts w:ascii="Arial" w:hAnsi="Arial" w:cs="Arial"/>
+          <w:sz w:val="20"/>
+          <w:szCs w:val="20"/>
+          <w:lang w:val="nl-BE"/>
+        </w:rPr>
+        <w:t xml:space="preserve">1990, </w:t>
+      </w:r>
+      <w:r>
+        <w:rPr>
+          <w:rFonts w:ascii="Arial" w:hAnsi="Arial" w:cs="Arial"/>
+          <w:sz w:val="20"/>
+          <w:szCs w:val="20"/>
+          <w:lang w:val="nl-BE"/>
+        </w:rPr>
+        <w:t>met onderscheiding</w:t>
       </w:r>
     </w:p>
     <w:p>
@@ -6490,11 +6481,12 @@
       <w:r>
         <w:rPr>
           <w:rFonts w:ascii="Arial" w:hAnsi="Arial" w:cs="Arial"/>
+          <w:b/>
           <w:sz w:val="20"/>
           <w:szCs w:val="20"/>
           <w:lang w:val="nl-BE"/>
         </w:rPr>
-        <w:t>Stedeli</w:t>
+        <w:t xml:space="preserve">Industriele Wetenschappen, </w:t>
       </w:r>
       <w:r>
         <w:rPr>
@@ -6503,104 +6495,14 @@
           <w:szCs w:val="20"/>
           <w:lang w:val="nl-BE"/>
         </w:rPr>
-        <w:t>j</w:t>
-      </w:r>
-      <w:r>
-        <w:rPr>
-          <w:rFonts w:ascii="Arial" w:hAnsi="Arial" w:cs="Arial"/>
-          <w:sz w:val="20"/>
-          <w:szCs w:val="20"/>
-          <w:lang w:val="nl-BE"/>
-        </w:rPr>
-        <w:t xml:space="preserve">ke </w:t>
-      </w:r>
-      <w:r>
-        <w:rPr>
-          <w:rFonts w:ascii="Arial" w:hAnsi="Arial" w:cs="Arial"/>
-          <w:sz w:val="20"/>
-          <w:szCs w:val="20"/>
-          <w:lang w:val="nl-BE"/>
-        </w:rPr>
-        <w:t xml:space="preserve">Industriele </w:t>
-      </w:r>
-      <w:r>
-        <w:rPr>
-          <w:rFonts w:ascii="Arial" w:hAnsi="Arial" w:cs="Arial"/>
-          <w:sz w:val="20"/>
-          <w:szCs w:val="20"/>
-          <w:lang w:val="nl-BE"/>
-        </w:rPr>
-        <w:t>Hogeschool Antwerpen</w:t>
-      </w:r>
-      <w:r>
-        <w:rPr>
-          <w:rFonts w:ascii="Arial" w:hAnsi="Arial" w:cs="Arial"/>
-          <w:sz w:val="20"/>
-          <w:szCs w:val="20"/>
-          <w:lang w:val="nl-BE"/>
-        </w:rPr>
-        <w:t xml:space="preserve">, </w:t>
-      </w:r>
-      <w:r>
-        <w:rPr>
-          <w:rFonts w:ascii="Arial" w:hAnsi="Arial" w:cs="Arial"/>
-          <w:sz w:val="20"/>
-          <w:szCs w:val="20"/>
-          <w:lang w:val="nl-BE"/>
-        </w:rPr>
-        <w:t xml:space="preserve">1990, </w:t>
-      </w:r>
-      <w:r>
-        <w:rPr>
-          <w:rFonts w:ascii="Arial" w:hAnsi="Arial" w:cs="Arial"/>
-          <w:sz w:val="20"/>
-          <w:szCs w:val="20"/>
-          <w:lang w:val="nl-BE"/>
-        </w:rPr>
-        <w:t>met onderscheiding</w:t>
+        <w:t>SISO Paardenmarkt Antwerpen</w:t>
       </w:r>
     </w:p>
     <w:p>
       <w:pPr>
-        <w:pStyle w:val="DefaultText"/>
-        <w:jc w:val="center"/>
-        <w:rPr>
-          <w:rFonts w:ascii="Arial" w:hAnsi="Arial" w:cs="Arial"/>
-          <w:sz w:val="20"/>
-          <w:szCs w:val="20"/>
-          <w:lang w:val="nl-BE"/>
-        </w:rPr>
-      </w:pPr>
-      <w:r>
-        <w:rPr>
-          <w:rFonts w:ascii="Arial" w:hAnsi="Arial" w:cs="Arial"/>
-          <w:b/>
-          <w:sz w:val="20"/>
-          <w:szCs w:val="20"/>
-          <w:lang w:val="nl-BE"/>
-        </w:rPr>
-        <w:t xml:space="preserve">Industriele Wetenschappen, </w:t>
-      </w:r>
-      <w:r>
-        <w:rPr>
-          <w:rFonts w:ascii="Arial" w:hAnsi="Arial" w:cs="Arial"/>
-          <w:sz w:val="20"/>
-          <w:szCs w:val="20"/>
-          <w:lang w:val="nl-BE"/>
-        </w:rPr>
-        <w:t>SISO Paardenmarkt Antwerpen</w:t>
-      </w:r>
-    </w:p>
-    <w:p>
-      <w:pPr>
-        <w:rPr>
-          <w:lang w:val="nl-BE"/>
-        </w:rPr>
-      </w:pPr>
-    </w:p>
-    <w:p>
-      <w:pPr>
-        <w:rPr>
+        <w:rPr>
+          <w:sz w:val="36"/>
+          <w:szCs w:val="28"/>
           <w:lang w:val="nl-BE"/>
         </w:rPr>
       </w:pPr>
@@ -6841,8 +6743,14 @@
         <w:t xml:space="preserve"> (CEFR B2)</w:t>
       </w:r>
     </w:p>
-    <w:p/>
-    <w:p/>
+    <w:p>
+      <w:pPr>
+        <w:rPr>
+          <w:sz w:val="36"/>
+          <w:szCs w:val="28"/>
+        </w:rPr>
+      </w:pPr>
+    </w:p>
     <w:p>
       <w:pPr>
         <w:pStyle w:val="Header"/>
@@ -6976,7 +6884,6 @@
         </w:rPr>
         <w:t xml:space="preserve">MS Office applications, </w:t>
       </w:r>
-      <w:proofErr w:type="gramStart"/>
       <w:r>
         <w:rPr>
           <w:rFonts w:ascii="Arial" w:hAnsi="Arial" w:cs="Arial"/>
@@ -6984,17 +6891,7 @@
           <w:szCs w:val="19"/>
           <w:lang w:eastAsia="en-GB"/>
         </w:rPr>
-        <w:t>Very</w:t>
-      </w:r>
-      <w:proofErr w:type="gramEnd"/>
-      <w:r>
-        <w:rPr>
-          <w:rFonts w:ascii="Arial" w:hAnsi="Arial" w:cs="Arial"/>
-          <w:sz w:val="20"/>
-          <w:szCs w:val="19"/>
-          <w:lang w:eastAsia="en-GB"/>
-        </w:rPr>
-        <w:t xml:space="preserve"> g</w:t>
+        <w:t>Very g</w:t>
       </w:r>
       <w:r>
         <w:rPr>
@@ -7423,7 +7320,7 @@
         <w:rFonts w:ascii="Arial" w:hAnsi="Arial" w:cs="Arial"/>
         <w:sz w:val="12"/>
       </w:rPr>
-      <w:t>7</w:t>
+      <w:t>8</w:t>
     </w:r>
     <w:r>
       <w:rPr>
@@ -7437,14 +7334,28 @@
         <w:rFonts w:ascii="Arial" w:hAnsi="Arial" w:cs="Arial"/>
         <w:sz w:val="12"/>
       </w:rPr>
-      <w:t>, May</w:t>
+      <w:t xml:space="preserve">, </w:t>
     </w:r>
     <w:r>
       <w:rPr>
         <w:rFonts w:ascii="Arial" w:hAnsi="Arial" w:cs="Arial"/>
         <w:sz w:val="12"/>
       </w:rPr>
-      <w:t xml:space="preserve"> ‘25</w:t>
+      <w:t>Feb</w:t>
+    </w:r>
+    <w:r>
+      <w:rPr>
+        <w:rFonts w:ascii="Arial" w:hAnsi="Arial" w:cs="Arial"/>
+        <w:sz w:val="12"/>
+      </w:rPr>
+      <w:t xml:space="preserve"> ‘2</w:t>
+    </w:r>
+    <w:r>
+      <w:rPr>
+        <w:rFonts w:ascii="Arial" w:hAnsi="Arial" w:cs="Arial"/>
+        <w:sz w:val="12"/>
+      </w:rPr>
+      <w:t>6</w:t>
     </w:r>
     <w:r>
       <w:rPr>
@@ -7584,7 +7495,7 @@
         <w:rFonts w:ascii="Arial" w:hAnsi="Arial" w:cs="Arial"/>
         <w:sz w:val="12"/>
       </w:rPr>
-      <w:t>7</w:t>
+      <w:t>8</w:t>
     </w:r>
     <w:r>
       <w:rPr>
@@ -7598,14 +7509,28 @@
         <w:rFonts w:ascii="Arial" w:hAnsi="Arial" w:cs="Arial"/>
         <w:sz w:val="12"/>
       </w:rPr>
-      <w:t>, May</w:t>
+      <w:t xml:space="preserve">, </w:t>
     </w:r>
     <w:r>
       <w:rPr>
         <w:rFonts w:ascii="Arial" w:hAnsi="Arial" w:cs="Arial"/>
         <w:sz w:val="12"/>
       </w:rPr>
-      <w:t xml:space="preserve"> ‘25</w:t>
+      <w:t>Feb</w:t>
+    </w:r>
+    <w:r>
+      <w:rPr>
+        <w:rFonts w:ascii="Arial" w:hAnsi="Arial" w:cs="Arial"/>
+        <w:sz w:val="12"/>
+      </w:rPr>
+      <w:t xml:space="preserve"> ‘2</w:t>
+    </w:r>
+    <w:r>
+      <w:rPr>
+        <w:rFonts w:ascii="Arial" w:hAnsi="Arial" w:cs="Arial"/>
+        <w:sz w:val="12"/>
+      </w:rPr>
+      <w:t>6</w:t>
     </w:r>
     <w:r>
       <w:rPr>

</xml_diff>